<commit_message>
Replace typographic Unicode characters with plain ASCII
Swaps em/en dashes, bullets, the pound sign and accented letters for
ASCII equivalents (GBP, hyphens, plain letters) so the report opens
cleanly across viewers that mishandle non-ASCII text.

Co-Authored-By: Claude Sonnet 5 <noreply@anthropic.com>
Claude-Session: https://claude.ai/code/session_013m5qVnYhUybdRqNsonVzMr
</commit_message>
<xml_diff>
--- a/rules-menu-redesign/Rules_Restaurant_Menu_Redesign_Report.docx
+++ b/rules-menu-redesign/Rules_Restaurant_Menu_Redesign_Report.docx
@@ -167,7 +167,7 @@
           <w:sz w:val="22"/>
           <w:szCs w:val="22"/>
         </w:rPr>
-        <w:t xml:space="preserve">Table 1 — Competitor benchmark: Rules vs. St. JOHN (Section 2.3)</w:t>
+        <w:t xml:space="preserve">Table 1 - Competitor benchmark: Rules vs. St. JOHN (Section 2.3)</w:t>
       </w:r>
     </w:p>
     <w:p>
@@ -180,7 +180,7 @@
           <w:sz w:val="22"/>
           <w:szCs w:val="22"/>
         </w:rPr>
-        <w:t xml:space="preserve">Table 2 — Gastronomy trends: evidence, source and verdict for Rules (Section 3.4)</w:t>
+        <w:t xml:space="preserve">Table 2 - Gastronomy trends: evidence, source and verdict for Rules (Section 3.4)</w:t>
       </w:r>
     </w:p>
     <w:p>
@@ -193,7 +193,7 @@
           <w:sz w:val="22"/>
           <w:szCs w:val="22"/>
         </w:rPr>
-        <w:t xml:space="preserve">Table 3 — Original vs proposed menu, dish-by-dish (Section 4.5)</w:t>
+        <w:t xml:space="preserve">Table 3 - Original vs proposed menu, dish-by-dish (Section 4.5)</w:t>
       </w:r>
     </w:p>
     <w:p>
@@ -206,7 +206,7 @@
           <w:sz w:val="22"/>
           <w:szCs w:val="22"/>
         </w:rPr>
-        <w:t xml:space="preserve">Table 4 — Indicative food-cost and gross-profit comparison (Section 5.2)</w:t>
+        <w:t xml:space="preserve">Table 4 - Indicative food-cost and gross-profit comparison (Section 5.2)</w:t>
       </w:r>
     </w:p>
     <w:p>
@@ -219,7 +219,7 @@
           <w:sz w:val="22"/>
           <w:szCs w:val="22"/>
         </w:rPr>
-        <w:t xml:space="preserve">Table 5 — Compliance checklist: Natasha's Law / HACCP / FHRS by dish (Section 5.3)</w:t>
+        <w:t xml:space="preserve">Table 5 - Compliance checklist: Natasha's Law / HACCP / FHRS by dish (Section 5.3)</w:t>
       </w:r>
     </w:p>
     <w:p>
@@ -248,7 +248,7 @@
           <w:sz w:val="22"/>
           <w:szCs w:val="22"/>
         </w:rPr>
-        <w:t xml:space="preserve">Figure 1 — Menu engineering matrix: Stars / Plowhorses / Puzzles / Dogs (Section 5.1)</w:t>
+        <w:t xml:space="preserve">Figure 1 - Menu engineering matrix: Stars / Plowhorses / Puzzles / Dogs (Section 5.1)</w:t>
       </w:r>
     </w:p>
     <w:p>
@@ -261,7 +261,7 @@
           <w:sz w:val="22"/>
           <w:szCs w:val="22"/>
         </w:rPr>
-        <w:t xml:space="preserve">Figure 2 — Implementation timeline, 12 weeks (Section 5.5)</w:t>
+        <w:t xml:space="preserve">Figure 2 - Implementation timeline, 12 weeks (Section 5.5)</w:t>
       </w:r>
     </w:p>
     <w:p>
@@ -308,7 +308,7 @@
           <w:sz w:val="22"/>
           <w:szCs w:val="22"/>
         </w:rPr>
-        <w:t xml:space="preserve">Justifying the timeliness of this analysis, Veganuary's (2025) End of Campaign Report recorded continued growth in UK sign-ups and mainstream plant-based trial, while Mintel's (2025) analysis of the UK meat-substitutes market points to a maturing but still-growing flexitarian consumer base — a segment almost entirely unaddressed by Rules' present à la carte structure, which offers no vegan dish on its main menu.</w:t>
+        <w:t xml:space="preserve">Justifying the timeliness of this analysis, Veganuary's (2025) End of Campaign Report recorded continued growth in UK sign-ups and mainstream plant-based trial, while Mintel's (2025) analysis of the UK meat-substitutes market points to a maturing but still-growing flexitarian consumer base - a segment almost entirely unaddressed by Rules' present a la carte structure, which offers no vegan dish on its main menu.</w:t>
       </w:r>
     </w:p>
     <w:p>
@@ -366,7 +366,7 @@
           <w:sz w:val="22"/>
           <w:szCs w:val="22"/>
         </w:rPr>
-        <w:t xml:space="preserve">Rules operates within the formal heritage British dining segment in Covent Garden, a location that delivers a dual footfall of pre-theatre diners seeking a time-pressured experience and post-theatre or leisure diners seeking a longer, occasion-led meal. The restaurant's identity rests on three pillars: its status as London's oldest restaurant, a specialism in game and pies rooted in British culinary tradition, and — most distinctively — direct ownership of a game estate in the High Pennines from which venison, grouse, partridge and other wild game are sourced. This vertical integration of the supply chain into the ownership structure of the business itself is a competitive asset that very few competitors in London's formal-dining segment can credibly claim: most restaurants marketing "provenance" are relaying a supplier relationship, whereas Rules is relaying direct ownership of the means of production.</w:t>
+        <w:t xml:space="preserve">Rules operates within the formal heritage British dining segment in Covent Garden, a location that delivers a dual footfall of pre-theatre diners seeking a time-pressured experience and post-theatre or leisure diners seeking a longer, occasion-led meal. The restaurant's identity rests on three pillars: its status as London's oldest restaurant, a specialism in game and pies rooted in British culinary tradition, and - most distinctively - direct ownership of a game estate in the High Pennines from which venison, grouse, partridge and other wild game are sourced. This vertical integration of the supply chain into the ownership structure of the business itself is a competitive asset that very few competitors in London's formal-dining segment can credibly claim: most restaurants marketing "provenance" are relaying a supplier relationship, whereas Rules is relaying direct ownership of the means of production.</w:t>
       </w:r>
     </w:p>
     <w:p>
@@ -379,7 +379,7 @@
           <w:sz w:val="22"/>
           <w:szCs w:val="22"/>
         </w:rPr>
-        <w:t xml:space="preserve">This dual footfall matters operationally: pre-theatre diners book a fixed, roughly two-hour window before curtain-up and are time- and price-sensitive, while leisure diners have more flexible timing and higher average spend. Treating both segments identically risks under-serving the former and over-formalising the latter; the "Rules at Lunch" format proposed in Section 4.4 targets the pre-theatre segment specifically, while the full à la carte evening service continues to serve the leisure occasion unchanged.</w:t>
+        <w:t xml:space="preserve">This dual footfall matters operationally: pre-theatre diners book a fixed, roughly two-hour window before curtain-up and are time- and price-sensitive, while leisure diners have more flexible timing and higher average spend. Treating both segments identically risks under-serving the former and over-formalising the latter; the "Rules at Lunch" format proposed in Section 4.4 targets the pre-theatre segment specifically, while the full a la carte evening service continues to serve the leisure occasion unchanged.</w:t>
       </w:r>
     </w:p>
     <w:p>
@@ -408,7 +408,7 @@
           <w:sz w:val="22"/>
           <w:szCs w:val="22"/>
         </w:rPr>
-        <w:t xml:space="preserve">The current menu follows a familiar heritage-British sequence: starters built around oysters and potted meats or fish; a game-led main-course section (venison, grouse, partridge or wood pigeon depending on season) alongside the signature steak-and-kidney and game pies; and a puddings section of traditional British desserts. A separate, short vegetarian menu exists alongside the main card as an adjunct rather than an integrated part of the core offer, and no vegan main course currently appears on the standard menu. Main courses are priced at roughly £21.95–£25 (indicative; to be verified against the live menu at rules.co.uk, per the reference note at item 36), with premium game priced above this band — positioning Rules within the mid-to-upper tier of formal London dining, below ultra-premium tasting-menu competitors but above casual and gastropub competitors, consistent with its Covent Garden tourist/theatre-district footfall.</w:t>
+        <w:t xml:space="preserve">The current menu follows a familiar heritage-British sequence: starters built around oysters and potted meats or fish; a game-led main-course section (venison, grouse, partridge or wood pigeon depending on season) alongside the signature steak-and-kidney and game pies; and a puddings section of traditional British desserts. A separate, short vegetarian menu exists alongside the main card as an adjunct rather than an integrated part of the core offer, and no vegan main course currently appears on the standard menu. Main courses are priced at roughly GBP 21.95-GBP 25 (indicative; to be verified against the live menu at rules.co.uk, per the reference note at item 36), with premium game priced above this band - positioning Rules within the mid-to-upper tier of formal London dining, below ultra-premium tasting-menu competitors but above casual and gastropub competitors, consistent with its Covent Garden tourist/theatre-district footfall.</w:t>
       </w:r>
     </w:p>
     <w:p>
@@ -693,7 +693,7 @@
                 <w:sz w:val="19"/>
                 <w:szCs w:val="19"/>
               </w:rPr>
-              <w:t xml:space="preserve">c. £21.95–£25, premium game priced above this band</w:t>
+              <w:t xml:space="preserve">c. GBP 21.95-GBP 25, premium game priced above this band</w:t>
             </w:r>
           </w:p>
         </w:tc>
@@ -720,7 +720,7 @@
                 <w:sz w:val="19"/>
                 <w:szCs w:val="19"/>
               </w:rPr>
-              <w:t xml:space="preserve">c. £18–£28 — broadly comparable</w:t>
+              <w:t xml:space="preserve">c. GBP 18-GBP 28 - broadly comparable</w:t>
             </w:r>
           </w:p>
         </w:tc>
@@ -1015,7 +1015,7 @@
           <w:sz w:val="22"/>
           <w:szCs w:val="22"/>
         </w:rPr>
-        <w:t xml:space="preserve">The comparison shows that Rules' gap relative to a like-for-like provenance-driven competitor is not a sourcing gap — Rules' traceability is, if anything, more direct — but a service-culture and dietary-inclusivity gap. St. JOHN's informal register is frequently read by diners as low-friction and unpretentious despite an equally serious culinary philosophy, whereas Rules' Georgian dining rooms and formal service are more frequently read, rightly or wrongly, as intimidating or exclusionary, particularly among younger or first-time diners. This pattern recurs in a minority of TripAdvisor reviews of Rules, which describe service as "frosty" or the overall experience as a "tourist trap" (TripAdvisor, n.d.), a theme returned to in Section 3.3.</w:t>
+        <w:t xml:space="preserve">The comparison shows that Rules' gap relative to a like-for-like provenance-driven competitor is not a sourcing gap - Rules' traceability is, if anything, more direct - but a service-culture and dietary-inclusivity gap. St. JOHN's informal register is frequently read by diners as low-friction and unpretentious despite an equally serious culinary philosophy, whereas Rules' Georgian dining rooms and formal service are more frequently read, rightly or wrongly, as intimidating or exclusionary, particularly among younger or first-time diners. This pattern recurs in a minority of TripAdvisor reviews of Rules, which describe service as "frosty" or the overall experience as a "tourist trap" (TripAdvisor, n.d.), a theme returned to in Section 3.3.</w:t>
       </w:r>
     </w:p>
     <w:p>
@@ -1028,7 +1028,7 @@
           <w:sz w:val="22"/>
           <w:szCs w:val="22"/>
         </w:rPr>
-        <w:t xml:space="preserve">The price-point row in Table 1 is close enough between the two venues that price itself is not the explanatory variable for any perceived gap: NielsenIQ/CGA's (2025) Hospitality Market Monitor places both within a broadly comparable per-head spend band for formal London dining. This confirms the differentiator is experiential and cultural rather than financial — why Section 4 proposes a service-format change alongside, not instead of, menu changes.</w:t>
+        <w:t xml:space="preserve">The price-point row in Table 1 is close enough between the two venues that price itself is not the explanatory variable for any perceived gap: NielsenIQ/CGA's (2025) Hospitality Market Monitor places both within a broadly comparable per-head spend band for formal London dining. This confirms the differentiator is experiential and cultural rather than financial - why Section 4 proposes a service-format change alongside, not instead of, menu changes.</w:t>
       </w:r>
     </w:p>
     <w:p>
@@ -1070,7 +1070,7 @@
           <w:sz w:val="22"/>
           <w:szCs w:val="22"/>
         </w:rPr>
-        <w:t xml:space="preserve">Applying the remaining two facets briefly: Rules' "personality" (the brand as if it were a person — traditional, authoritative, unhurried) and "self-image" (how the diner wants to see themselves when eating there — as someone with an appreciation for history and provenance) are also coherent with physique and culture, so four of the prism's six facets are internally aligned. The model does, however, have a known limitation when applied to a business with a genuinely dual audience: Kapferer's prism implicitly assumes a single, unified target consumer, whereas Rules simultaneously serves London-based repeat diners seeking authenticity and international tourists seeking a heritage experience, and these two audiences may read the same reflection and relationship signals quite differently. A prism analysis that treats Rules' customer base as homogeneous therefore risks overstating the service-culture problem for local diners while understating it for first-time visitors — a caveat carried into the self-critique in Section 5.6.</w:t>
+        <w:t xml:space="preserve">Applying the remaining two facets briefly: Rules' "personality" (the brand as if it were a person - traditional, authoritative, unhurried) and "self-image" (how the diner wants to see themselves when eating there - as someone with an appreciation for history and provenance) are also coherent with physique and culture, so four of the prism's six facets are internally aligned. The model does, however, have a known limitation when applied to a business with a genuinely dual audience: Kapferer's prism implicitly assumes a single, unified target consumer, whereas Rules simultaneously serves London-based repeat diners seeking authenticity and international tourists seeking a heritage experience, and these two audiences may read the same reflection and relationship signals quite differently. A prism analysis that treats Rules' customer base as homogeneous therefore risks overstating the service-culture problem for local diners while understating it for first-time visitors - a caveat carried into the self-critique in Section 5.6.</w:t>
       </w:r>
     </w:p>
     <w:p>
@@ -1157,7 +1157,7 @@
           <w:sz w:val="22"/>
           <w:szCs w:val="22"/>
         </w:rPr>
-        <w:t xml:space="preserve">The second trend points the opposite way. Veganuary's (2025) End of Campaign Report recorded continued year-on-year growth in UK participation, and NielsenIQ/CGA's Hospitality Health Check (2026) and Hospitality Market Monitor (2025) data show sustained growth in vegan and plant-based order volumes across UK eating-out occasions. Mintel's (2025) UK Meat Substitutes Market Dynamics report describes a maturing but still-expanding flexitarian segment rather than a niche one. Against this trend, a heritage game-and-pie specialist with no vegan main course is not merely conservative but is measurably leaving covers on the table, particularly among mixed dining parties — where a single flexitarian or vegan diner can determine the venue choice for an entire group — which make up a meaningful share of pre-theatre bookings.</w:t>
+        <w:t xml:space="preserve">The second trend points the opposite way. Veganuary's (2025) End of Campaign Report recorded continued year-on-year growth in UK participation, and NielsenIQ/CGA's Hospitality Health Check (2026) and Hospitality Market Monitor (2025) data show sustained growth in vegan and plant-based order volumes across UK eating-out occasions. Mintel's (2025) UK Meat Substitutes Market Dynamics report describes a maturing but still-expanding flexitarian segment rather than a niche one. Against this trend, a heritage game-and-pie specialist with no vegan main course is not merely conservative but is measurably leaving covers on the table, particularly among mixed dining parties - where a single flexitarian or vegan diner can determine the venue choice for an entire group - which make up a meaningful share of pre-theatre bookings.</w:t>
       </w:r>
     </w:p>
     <w:p>
@@ -1199,7 +1199,7 @@
           <w:sz w:val="22"/>
           <w:szCs w:val="22"/>
         </w:rPr>
-        <w:t xml:space="preserve">The third trend is less a menu trend than a customer-experience trend, but it is material because perceived accessibility shapes whether a diner ever reaches the menu at all. A recurring minority pattern across TripAdvisor reviews of Rules and commentary in The Good Food Guide describes the service register as "frosty," the pricing as poor value for tourists, or the overall experience as a "tourist trap" — language that signals a perceived barrier to entry rather than a judgement on food quality. Ajzen's (1991) Theory of Planned Behaviour, and its extensions in the restaurant-choice literature, frames this usefully: a diner's intention to visit is shaped not only by attitude toward the food but by subjective norms (will people like me be comfortable here?) and perceived behavioural control (can I navigate this menu and this room without feeling exposed?). A frosty-service perception operates directly on perceived behavioural control, independent of food quality, and is therefore a genuine barrier-to-entry problem that a menu redesign alone cannot fix; it requires a complementary service-format change (Section 4.4).</w:t>
+        <w:t xml:space="preserve">The third trend is less a menu trend than a customer-experience trend, but it is material because perceived accessibility shapes whether a diner ever reaches the menu at all. A recurring minority pattern across TripAdvisor reviews of Rules and commentary in The Good Food Guide describes the service register as "frosty," the pricing as poor value for tourists, or the overall experience as a "tourist trap" - language that signals a perceived barrier to entry rather than a judgement on food quality. Ajzen's (1991) Theory of Planned Behaviour, and its extensions in the restaurant-choice literature, frames this usefully: a diner's intention to visit is shaped not only by attitude toward the food but by subjective norms (will people like me be comfortable here?) and perceived behavioural control (can I navigate this menu and this room without feeling exposed?). A frosty-service perception operates directly on perceived behavioural control, independent of food quality, and is therefore a genuine barrier-to-entry problem that a menu redesign alone cannot fix; it requires a complementary service-format change (Section 4.4).</w:t>
       </w:r>
     </w:p>
     <w:p>
@@ -1241,7 +1241,7 @@
           <w:sz w:val="22"/>
           <w:szCs w:val="22"/>
         </w:rPr>
-        <w:t xml:space="preserve">Table 2 summarises the three trends against the evidence base and assigns Rules a differentiated verdict, rather than treating "heritage" as a single undifferentiated weakness. The purpose of presenting the verdicts side by side is to make explicit that Rules' problem is not that it is behind the curve in general — on the trend most commonly associated with critiques of heritage dining as outdated, it is ahead — but that it has one specific, addressable gap in menu content and one specific, addressable gap in service format, each treated separately in the proposal that follows.</w:t>
+        <w:t xml:space="preserve">Table 2 summarises the three trends against the evidence base and assigns Rules a differentiated verdict, rather than treating "heritage" as a single undifferentiated weakness. The purpose of presenting the verdicts side by side is to make explicit that Rules' problem is not that it is behind the curve in general - on the trend most commonly associated with critiques of heritage dining as outdated, it is ahead - but that it has one specific, addressable gap in menu content and one specific, addressable gap in service format, each treated separately in the proposal that follows.</w:t>
       </w:r>
     </w:p>
     <w:tbl>
@@ -1761,7 +1761,7 @@
           <w:sz w:val="22"/>
           <w:szCs w:val="22"/>
         </w:rPr>
-        <w:t xml:space="preserve">A limitation of the TPB framing used above should be acknowledged rather than glossed over: the theory models a rational, deliberative choice process, and is less well suited to explaining the loyalty of Rules' existing older or occasion-driven clientele, whose repeat attendance may be driven by habit and identity signalling rather than a fresh cost-benefit evaluation of accessibility on every visit. Any response to Trend 3 must therefore be judged not only on whether it lowers barriers for new diners, but on whether it risks unsettling the habitual behaviour of the clientele that a purely rational-choice model does not fully capture — a tension returned to directly in the self-critique in Section 5.6.</w:t>
+        <w:t xml:space="preserve">A limitation of the TPB framing used above should be acknowledged rather than glossed over: the theory models a rational, deliberative choice process, and is less well suited to explaining the loyalty of Rules' existing older or occasion-driven clientele, whose repeat attendance may be driven by habit and identity signalling rather than a fresh cost-benefit evaluation of accessibility on every visit. Any response to Trend 3 must therefore be judged not only on whether it lowers barriers for new diners, but on whether it risks unsettling the habitual behaviour of the clientele that a purely rational-choice model does not fully capture - a tension returned to directly in the self-critique in Section 5.6.</w:t>
       </w:r>
     </w:p>
     <w:p>
@@ -1890,7 +1890,7 @@
           <w:sz w:val="22"/>
           <w:szCs w:val="22"/>
         </w:rPr>
-        <w:t xml:space="preserve">A third addition — a seasonal vegetable and pearl-barley dish using whatever the estate garden or Covent Garden market yields that week — is deliberately specified as a rotating rather than fixed item, both to manage the seasonal-supply risk flagged in Section 5.6 and to let the kitchen market it using the same market-led, seasonal language long associated with serious British cooking, rather than presenting it as a static concession to a trend. All three dishes are costed and evaluated in Section 5.2 before any commitment to permanent menu status.</w:t>
+        <w:t xml:space="preserve">A third addition - a seasonal vegetable and pearl-barley dish using whatever the estate garden or Covent Garden market yields that week - is deliberately specified as a rotating rather than fixed item, both to manage the seasonal-supply risk flagged in Section 5.6 and to let the kitchen market it using the same market-led, seasonal language long associated with serious British cooking, rather than presenting it as a static concession to a trend. All three dishes are costed and evaluated in Section 5.2 before any commitment to permanent menu status.</w:t>
       </w:r>
     </w:p>
     <w:p>
@@ -1919,7 +1919,7 @@
           <w:sz w:val="22"/>
           <w:szCs w:val="22"/>
         </w:rPr>
-        <w:t xml:space="preserve">To address the accessibility gap identified in Section 3.3, the proposal introduces a shorter, fixed-format "Rules at Lunch" menu offered during the pre-theatre and weekday lunch window: a reduced choice of two or three dishes per course, a clear price ceiling, and menu language stripped of unexplained heritage terminology. This does not replace the full à la carte experience, which remains the primary evening offer and preserves the formal register that repeat and occasion diners expect, but gives a lower-commitment, lower-perceived-risk entry point for first-time or price-sensitive diners, targeting the perceived-behavioural-control barrier identified through the TPB framing in Section 3.3.</w:t>
+        <w:t xml:space="preserve">To address the accessibility gap identified in Section 3.3, the proposal introduces a shorter, fixed-format "Rules at Lunch" menu offered during the pre-theatre and weekday lunch window: a reduced choice of two or three dishes per course, a clear price ceiling, and menu language stripped of unexplained heritage terminology. This does not replace the full a la carte experience, which remains the primary evening offer and preserves the formal register that repeat and occasion diners expect, but gives a lower-commitment, lower-perceived-risk entry point for first-time or price-sensitive diners, targeting the perceived-behavioural-control barrier identified through the TPB framing in Section 3.3.</w:t>
       </w:r>
     </w:p>
     <w:p>
@@ -1932,7 +1932,7 @@
           <w:sz w:val="22"/>
           <w:szCs w:val="22"/>
         </w:rPr>
-        <w:t xml:space="preserve">The £28/£34 price ceiling for "Rules at Lunch" is set deliberately below the per-head spend band identified in Section 2.3 for full à la carte dining at comparable formal London venues, so that the format reads unambiguously as a lower-commitment option rather than a discounted version of the same experience — a distinction that matters for protecting the perceived value, and the margin, of the evening service.</w:t>
+        <w:t xml:space="preserve">The GBP 28/GBP 34 price ceiling for "Rules at Lunch" is set deliberately below the per-head spend band identified in Section 2.3 for full a la carte dining at comparable formal London venues, so that the format reads unambiguously as a lower-commitment option rather than a discounted version of the same experience - a distinction that matters for protecting the perceived value, and the margin, of the evening service.</w:t>
       </w:r>
     </w:p>
     <w:p>
@@ -2246,7 +2246,7 @@
                 <w:sz w:val="19"/>
                 <w:szCs w:val="19"/>
               </w:rPr>
-              <w:t xml:space="preserve">£12.50</w:t>
+              <w:t xml:space="preserve">GBP 12.50</w:t>
             </w:r>
           </w:p>
         </w:tc>
@@ -2306,7 +2306,7 @@
                 <w:sz w:val="19"/>
                 <w:szCs w:val="19"/>
               </w:rPr>
-              <w:t xml:space="preserve">Mains — game</w:t>
+              <w:t xml:space="preserve">Mains - game</w:t>
             </w:r>
           </w:p>
         </w:tc>
@@ -2387,7 +2387,7 @@
                 <w:sz w:val="19"/>
                 <w:szCs w:val="19"/>
               </w:rPr>
-              <w:t xml:space="preserve">£34.00</w:t>
+              <w:t xml:space="preserve">GBP 34.00</w:t>
             </w:r>
           </w:p>
         </w:tc>
@@ -2447,7 +2447,7 @@
                 <w:sz w:val="19"/>
                 <w:szCs w:val="19"/>
               </w:rPr>
-              <w:t xml:space="preserve">Mains — pie</w:t>
+              <w:t xml:space="preserve">Mains - pie</w:t>
             </w:r>
           </w:p>
         </w:tc>
@@ -2503,7 +2503,7 @@
                 <w:sz w:val="19"/>
                 <w:szCs w:val="19"/>
               </w:rPr>
-              <w:t xml:space="preserve">Unchanged — retained as core identity dish (Star, Fig. 1)</w:t>
+              <w:t xml:space="preserve">Unchanged - retained as core identity dish (Star, Fig. 1)</w:t>
             </w:r>
           </w:p>
         </w:tc>
@@ -2531,7 +2531,7 @@
                 <w:sz w:val="19"/>
                 <w:szCs w:val="19"/>
               </w:rPr>
-              <w:t xml:space="preserve">£24.50</w:t>
+              <w:t xml:space="preserve">GBP 24.50</w:t>
             </w:r>
           </w:p>
         </w:tc>
@@ -2591,7 +2591,7 @@
                 <w:sz w:val="19"/>
                 <w:szCs w:val="19"/>
               </w:rPr>
-              <w:t xml:space="preserve">Mains — new</w:t>
+              <w:t xml:space="preserve">Mains - new</w:t>
             </w:r>
           </w:p>
         </w:tc>
@@ -2618,7 +2618,7 @@
                 <w:sz w:val="19"/>
                 <w:szCs w:val="19"/>
               </w:rPr>
-              <w:t xml:space="preserve">—</w:t>
+              <w:t xml:space="preserve"> - </w:t>
             </w:r>
           </w:p>
         </w:tc>
@@ -2672,7 +2672,7 @@
                 <w:sz w:val="19"/>
                 <w:szCs w:val="19"/>
               </w:rPr>
-              <w:t xml:space="preserve">£22.00</w:t>
+              <w:t xml:space="preserve">GBP 22.00</w:t>
             </w:r>
           </w:p>
         </w:tc>
@@ -2732,7 +2732,7 @@
                 <w:sz w:val="19"/>
                 <w:szCs w:val="19"/>
               </w:rPr>
-              <w:t xml:space="preserve">Mains — new</w:t>
+              <w:t xml:space="preserve">Mains - new</w:t>
             </w:r>
           </w:p>
         </w:tc>
@@ -2760,7 +2760,7 @@
                 <w:sz w:val="19"/>
                 <w:szCs w:val="19"/>
               </w:rPr>
-              <w:t xml:space="preserve">—</w:t>
+              <w:t xml:space="preserve"> - </w:t>
             </w:r>
           </w:p>
         </w:tc>
@@ -2816,7 +2816,7 @@
                 <w:sz w:val="19"/>
                 <w:szCs w:val="19"/>
               </w:rPr>
-              <w:t xml:space="preserve">£21.50</w:t>
+              <w:t xml:space="preserve">GBP 21.50</w:t>
             </w:r>
           </w:p>
         </w:tc>
@@ -2903,7 +2903,7 @@
                 <w:sz w:val="19"/>
                 <w:szCs w:val="19"/>
               </w:rPr>
-              <w:t xml:space="preserve">À la carte only, full menu at all sittings</w:t>
+              <w:t xml:space="preserve">A la carte only, full menu at all sittings</w:t>
             </w:r>
           </w:p>
         </w:tc>
@@ -2957,7 +2957,7 @@
                 <w:sz w:val="19"/>
                 <w:szCs w:val="19"/>
               </w:rPr>
-              <w:t xml:space="preserve">£28 (2 courses) / £34 (3 courses)</w:t>
+              <w:t xml:space="preserve">GBP 28 (2 courses) / GBP 34 (3 courses)</w:t>
             </w:r>
           </w:p>
         </w:tc>
@@ -3060,7 +3060,7 @@
           <w:sz w:val="22"/>
           <w:szCs w:val="22"/>
         </w:rPr>
-        <w:t xml:space="preserve">Kasavana and Smith's (1982) menu engineering matrix classifies dishes by popularity and contribution margin into Stars (high popularity, high margin), Plowhorses (high popularity, low margin), Puzzles (low popularity, high margin) and Dogs (low popularity, low margin). Figure 1 applies this matrix to Rules' existing best-sellers and the proposed additions: the steak-and-kidney pie and roast pheasant are positioned as Stars on the basis of established volume and healthy margin on estate-sourced protein; the proposed root-vegetable and wild-mushroom pie is plotted as a provisional Puzzle, since it is expected to carry a high margin but its popularity is unproven until trialled; and existing under-ordered vegetarian dishes are flagged as candidates for removal as Dogs. The matrix is a genuinely useful trial-design tool, but it is not applied uncritically: Bujalance-López et al. (2025) note that classical menu engineering treats each dish's popularity as independent, when in practice a new dish can cannibalise an existing one through item substitution. A new plant-forward main is likely to draw covers away from Rules' existing vegetarian starters and game mains rather than adding only incremental covers, and the trial period in Figure 2 is designed specifically to observe this substitution effect before the new dishes are given permanent menu status.</w:t>
+        <w:t xml:space="preserve">Kasavana and Smith's (1982) menu engineering matrix classifies dishes by popularity and contribution margin into Stars (high popularity, high margin), Plowhorses (high popularity, low margin), Puzzles (low popularity, high margin) and Dogs (low popularity, low margin). Figure 1 applies this matrix to Rules' existing best-sellers and the proposed additions: the steak-and-kidney pie and roast pheasant are positioned as Stars on the basis of established volume and healthy margin on estate-sourced protein; the proposed root-vegetable and wild-mushroom pie is plotted as a provisional Puzzle, since it is expected to carry a high margin but its popularity is unproven until trialled; and existing under-ordered vegetarian dishes are flagged as candidates for removal as Dogs. The matrix is a genuinely useful trial-design tool, but it is not applied uncritically: Bujalance-Lopez et al. (2025) note that classical menu engineering treats each dish's popularity as independent, when in practice a new dish can cannibalise an existing one through item substitution. A new plant-forward main is likely to draw covers away from Rules' existing vegetarian starters and game mains rather than adding only incremental covers, and the trial period in Figure 2 is designed specifically to observe this substitution effect before the new dishes are given permanent menu status.</w:t>
       </w:r>
     </w:p>
     <w:p>
@@ -3073,7 +3073,7 @@
           <w:sz w:val="22"/>
           <w:szCs w:val="22"/>
         </w:rPr>
-        <w:t xml:space="preserve">It is also worth noting that Kasavana and Smith's (1982) model was developed for high-volume American commercial foodservice, where popularity data are abundant and dish substitution across a large, frequently changing menu is the norm. Rules' menu changes far less frequently and carries a small number of heritage dishes whose "popularity" is bound up with brand loyalty rather than pure preference — precisely the condition under which Bujalance-López et al.'s (2025) substitution critique bites hardest, and precisely why the matrix here is used to design a trial rather than to justify an immediate, permanent menu decision.</w:t>
+        <w:t xml:space="preserve">It is also worth noting that Kasavana and Smith's (1982) model was developed for high-volume American commercial foodservice, where popularity data are abundant and dish substitution across a large, frequently changing menu is the norm. Rules' menu changes far less frequently and carries a small number of heritage dishes whose "popularity" is bound up with brand loyalty rather than pure preference - precisely the condition under which Bujalance-Lopez et al.'s (2025) substitution critique bites hardest, and precisely why the matrix here is used to design a trial rather than to justify an immediate, permanent menu decision.</w:t>
       </w:r>
     </w:p>
     <w:tbl>
@@ -3249,7 +3249,7 @@
                 <w:sz w:val="19"/>
                 <w:szCs w:val="19"/>
               </w:rPr>
-              <w:t xml:space="preserve">• Steak and kidney pie</w:t>
+              <w:t xml:space="preserve">- Steak and kidney pie</w:t>
             </w:r>
           </w:p>
           <w:p>
@@ -3264,7 +3264,7 @@
                 <w:sz w:val="19"/>
                 <w:szCs w:val="19"/>
               </w:rPr>
-              <w:t xml:space="preserve">• Roast pheasant</w:t>
+              <w:t xml:space="preserve">- Roast pheasant</w:t>
             </w:r>
           </w:p>
         </w:tc>
@@ -3307,7 +3307,7 @@
                 <w:sz w:val="19"/>
                 <w:szCs w:val="19"/>
               </w:rPr>
-              <w:t xml:space="preserve">• Root veg &amp; wild mushroom pie (proposed — trial)</w:t>
+              <w:t xml:space="preserve">- Root veg &amp; wild mushroom pie (proposed - trial)</w:t>
             </w:r>
           </w:p>
         </w:tc>
@@ -3382,7 +3382,7 @@
                 <w:sz w:val="19"/>
                 <w:szCs w:val="19"/>
               </w:rPr>
-              <w:t xml:space="preserve">• Oysters</w:t>
+              <w:t xml:space="preserve">- Oysters</w:t>
             </w:r>
           </w:p>
           <w:p>
@@ -3397,7 +3397,7 @@
                 <w:sz w:val="19"/>
                 <w:szCs w:val="19"/>
               </w:rPr>
-              <w:t xml:space="preserve">• Potted game</w:t>
+              <w:t xml:space="preserve">- Potted game</w:t>
             </w:r>
           </w:p>
         </w:tc>
@@ -3440,7 +3440,7 @@
                 <w:sz w:val="19"/>
                 <w:szCs w:val="19"/>
               </w:rPr>
-              <w:t xml:space="preserve">• Under-ordered existing vegetarian dishes (candidates for removal)</w:t>
+              <w:t xml:space="preserve">- Under-ordered existing vegetarian dishes (candidates for removal)</w:t>
             </w:r>
           </w:p>
         </w:tc>
@@ -3487,7 +3487,7 @@
           <w:sz w:val="22"/>
           <w:szCs w:val="22"/>
         </w:rPr>
-        <w:t xml:space="preserve">Table 4 estimates indicative gross-profit percentages for existing and proposed dishes. A common but unexamined assumption is that plant-based dishes are automatically cheaper to produce than meat dishes; this does not hold cleanly at Rules, because the comparison is not against commodity meat but against wild game that the business already owns outright, giving a near-zero marginal input cost once the estate's fixed costs are covered. Estate-grown vegetables, by contrast, carry genuine costs — labour-intensive kitchen-garden cultivation, seasonal yield variability, and the opportunity cost of land that could otherwise expand game habitat — which must be costed honestly rather than assumed away. The proposal should therefore not be justified financially on "vegetables are cheap" grounds; it should be justified on incremental-cover and average-spend grounds, attracting parties that would not otherwise book, with food cost held to a comparable or only marginally improved percentage against the existing game-led dishes.</w:t>
+        <w:t xml:space="preserve">Table 4 estimates indicative gross-profit percentages for existing and proposed dishes. A common but unexamined assumption is that plant-based dishes are automatically cheaper to produce than meat dishes; this does not hold cleanly at Rules, because the comparison is not against commodity meat but against wild game that the business already owns outright, giving a near-zero marginal input cost once the estate's fixed costs are covered. Estate-grown vegetables, by contrast, carry genuine costs - labour-intensive kitchen-garden cultivation, seasonal yield variability, and the opportunity cost of land that could otherwise expand game habitat - which must be costed honestly rather than assumed away. The proposal should therefore not be justified financially on "vegetables are cheap" grounds; it should be justified on incremental-cover and average-spend grounds, attracting parties that would not otherwise book, with food cost held to a comparable or only marginally improved percentage against the existing game-led dishes.</w:t>
       </w:r>
     </w:p>
     <w:p>
@@ -3500,7 +3500,7 @@
           <w:sz w:val="22"/>
           <w:szCs w:val="22"/>
         </w:rPr>
-        <w:t xml:space="preserve">These figures are illustrative estimates built from typical UK formal-dining food-cost benchmarks rather than Rules' actual kitchen accounts, and should be replaced with audited cost data before any investment decision is made; their purpose here is to demonstrate the correct basis for comparison — estate-owned protein against labour-intensive horticulture — rather than to assert precise percentages. On this basis, the two proposed dishes would need to sell at only a modest fraction of the volume of the existing Star dishes to cover their incremental kitchen-garden labour cost, which is the specific, numerically grounded question the trial in Figure 2 is designed to answer before a permanent price or portfolio decision is taken.</w:t>
+        <w:t xml:space="preserve">These figures are illustrative estimates built from typical UK formal-dining food-cost benchmarks rather than Rules' actual kitchen accounts, and should be replaced with audited cost data before any investment decision is made; their purpose here is to demonstrate the correct basis for comparison - estate-owned protein against labour-intensive horticulture - rather than to assert precise percentages. On this basis, the two proposed dishes would need to sell at only a modest fraction of the volume of the existing Star dishes to cover their incremental kitchen-garden labour cost, which is the specific, numerically grounded question the trial in Figure 2 is designed to answer before a permanent price or portfolio decision is taken.</w:t>
       </w:r>
     </w:p>
     <w:tbl>
@@ -3868,7 +3868,7 @@
                 <w:sz w:val="19"/>
                 <w:szCs w:val="19"/>
               </w:rPr>
-              <w:t xml:space="preserve">Near-zero marginal input cost — estate-owned protein</w:t>
+              <w:t xml:space="preserve">Near-zero marginal input cost - estate-owned protein</w:t>
             </w:r>
           </w:p>
         </w:tc>
@@ -4145,7 +4145,7 @@
           <w:sz w:val="22"/>
           <w:szCs w:val="22"/>
         </w:rPr>
-        <w:t xml:space="preserve">Introducing new dishes into a kitchen whose primary risk profile is built around wild game handling raises compliance considerations distinct from a standard menu change. Under the Food Information (Amendment) (England) Regulations 2019 ("Natasha's Law"), full ingredient and allergen labelling is required and must be current for all new dishes at point of service; the plant-forward dishes' allergen profile (particularly nuts, gluten in pastry, and dairy-based enrichments) must be documented with the same rigour currently applied to game-derived allergens. HACCP control points specific to wild game — controlled hanging times, monitoring for embedded shot, and segregated storage and preparation surfaces — must be reviewed to ensure new plant-forward preparation does not introduce cross-contamination risk in either direction, whether game residue affecting a dish marketed as vegetarian or vegan, or the reverse affecting allergen claims. FSA Food Hygiene Rating Scheme status should be actively protected through the transition by documenting the HACCP review and staff briefing as part of the standard due-diligence file, rather than treated as a formality. Table 5 maps these requirements against both existing and proposed dishes.</w:t>
+        <w:t xml:space="preserve">Introducing new dishes into a kitchen whose primary risk profile is built around wild game handling raises compliance considerations distinct from a standard menu change. Under the Food Information (Amendment) (England) Regulations 2019 ("Natasha's Law"), full ingredient and allergen labelling is required and must be current for all new dishes at point of service; the plant-forward dishes' allergen profile (particularly nuts, gluten in pastry, and dairy-based enrichments) must be documented with the same rigour currently applied to game-derived allergens. HACCP control points specific to wild game - controlled hanging times, monitoring for embedded shot, and segregated storage and preparation surfaces - must be reviewed to ensure new plant-forward preparation does not introduce cross-contamination risk in either direction, whether game residue affecting a dish marketed as vegetarian or vegan, or the reverse affecting allergen claims. FSA Food Hygiene Rating Scheme status should be actively protected through the transition by documenting the HACCP review and staff briefing as part of the standard due-diligence file, rather than treated as a formality. Table 5 maps these requirements against both existing and proposed dishes.</w:t>
       </w:r>
     </w:p>
     <w:tbl>
@@ -4374,7 +4374,7 @@
                 <w:sz w:val="19"/>
                 <w:szCs w:val="19"/>
               </w:rPr>
-              <w:t xml:space="preserve">HACCP — game handling (hanging, shot removal)</w:t>
+              <w:t xml:space="preserve">HACCP - game handling (hanging, shot removal)</w:t>
             </w:r>
           </w:p>
         </w:tc>
@@ -4621,7 +4621,7 @@
           <w:sz w:val="20"/>
           <w:szCs w:val="20"/>
         </w:rPr>
-        <w:t xml:space="preserve">Table 5. Compliance checklist — Natasha's Law, HACCP and FHRS — mapped to existing and proposed dishes.</w:t>
+        <w:t xml:space="preserve">Table 5. Compliance checklist - Natasha's Law, HACCP and FHRS - mapped to existing and proposed dishes.</w:t>
       </w:r>
     </w:p>
     <w:p>
@@ -4650,7 +4650,7 @@
           <w:sz w:val="22"/>
           <w:szCs w:val="22"/>
         </w:rPr>
-        <w:t xml:space="preserve">Where Sections 5.1–5.3 identify genuine new work, this sub-section identifies work Rules has effectively already done. Whole-animal game butchery is inherently lower-waste than commodity meat purchasing, because the estate model requires using the whole animal across multiple menu items rather than ordering pre-portioned cuts — a practice directly aligned with WRAP's guidance on where hospitality food waste arises and with Food Made Good's (2024, 2025) sourcing and waste criteria. The strategic task here is formalisation and disclosure rather than operational change: documenting existing whole-animal utilisation rates, estate transport food-miles, and waste-diversion practices in a form that can be submitted to, and scored by, frameworks such as Food Made Good, converting an unrecognised operational strength into a marketable and auditable sustainability credential.</w:t>
+        <w:t xml:space="preserve">Where Sections 5.1-5.3 identify genuine new work, this sub-section identifies work Rules has effectively already done. Whole-animal game butchery is inherently lower-waste than commodity meat purchasing, because the estate model requires using the whole animal across multiple menu items rather than ordering pre-portioned cuts - a practice directly aligned with WRAP's guidance on where hospitality food waste arises and with Food Made Good's (2024, 2025) sourcing and waste criteria. The strategic task here is formalisation and disclosure rather than operational change: documenting existing whole-animal utilisation rates, estate transport food-miles, and waste-diversion practices in a form that can be submitted to, and scored by, frameworks such as Food Made Good, converting an unrecognised operational strength into a marketable and auditable sustainability credential.</w:t>
       </w:r>
     </w:p>
     <w:p>
@@ -5833,7 +5833,7 @@
           <w:sz w:val="22"/>
           <w:szCs w:val="22"/>
         </w:rPr>
-        <w:t xml:space="preserve">This proposal is not costless. There is a genuine risk of diluting a 227-year-old brand identity if plant-forward dishes or a simplified lunch format are perceived by loyal or occasion diners as a departure from what Rules is understood to be. The estate's kitchen-garden capacity and seasonal availability are unproven at any meaningful covers volume, meaning the plant-forward dishes may need to fall back on bought-in produce in poor growing years, undermining the very provenance narrative they are meant to reinforce. Most seriously, it is entirely possible that Rules' existing, more traditional clientele has no appetite for any of these changes and would treat their introduction with the same suspicion that the frosty-service critique currently attaches to the present format — a risk this report has not tested directly and which should be piloted, not assumed away, before any permanent menu change.</w:t>
+        <w:t xml:space="preserve">This proposal is not costless. There is a genuine risk of diluting a 227-year-old brand identity if plant-forward dishes or a simplified lunch format are perceived by loyal or occasion diners as a departure from what Rules is understood to be. The estate's kitchen-garden capacity and seasonal availability are unproven at any meaningful covers volume, meaning the plant-forward dishes may need to fall back on bought-in produce in poor growing years, undermining the very provenance narrative they are meant to reinforce. Most seriously, it is entirely possible that Rules' existing, more traditional clientele has no appetite for any of these changes and would treat their introduction with the same suspicion that the frosty-service critique currently attaches to the present format - a risk this report has not tested directly and which should be piloted, not assumed away, before any permanent menu change.</w:t>
       </w:r>
     </w:p>
     <w:p>
@@ -5875,7 +5875,7 @@
           <w:sz w:val="22"/>
           <w:szCs w:val="22"/>
         </w:rPr>
-        <w:t xml:space="preserve">The proposed response — visible provenance labelling, estate-and-market plant-forward dishes framed as an extension of existing sourcing philosophy, and a shorter "Rules at Lunch" format addressing the accessibility barrier — is designed throughout to extend Kapferer's (2008) "physique" and "culture" facets rather than replace them, while directly repairing the "reflection" and "relationship" facets identified as the source of friction. The menu-engineering, financial, compliance and sustainability analysis in Section 5 shows this can be implemented without assuming plant-based dishes are automatically cheaper or lower-risk, and the self-critique makes clear that clientele resistance and estate-supply constraints are real risks to be piloted, not assumed away. The central recommendation is therefore not "modernise a heritage menu," but a more precise instruction: formalise and market the provenance advantage Rules already holds, and close the two specific, evidenced gaps — plant-based main-menu inclusion and service-format accessibility — that currently sit alongside it.</w:t>
+        <w:t xml:space="preserve">The proposed response - visible provenance labelling, estate-and-market plant-forward dishes framed as an extension of existing sourcing philosophy, and a shorter "Rules at Lunch" format addressing the accessibility barrier - is designed throughout to extend Kapferer's (2008) "physique" and "culture" facets rather than replace them, while directly repairing the "reflection" and "relationship" facets identified as the source of friction. The menu-engineering, financial, compliance and sustainability analysis in Section 5 shows this can be implemented without assuming plant-based dishes are automatically cheaper or lower-risk, and the self-critique makes clear that clientele resistance and estate-supply constraints are real risks to be piloted, not assumed away. The central recommendation is therefore not "modernise a heritage menu," but a more precise instruction: formalise and market the provenance advantage Rules already holds, and close the two specific, evidenced gaps - plant-based main-menu inclusion and service-format accessibility - that currently sit alongside it.</w:t>
       </w:r>
     </w:p>
     <w:p>
@@ -5925,7 +5925,7 @@
           <w:sz w:val="20"/>
           <w:szCs w:val="20"/>
         </w:rPr>
-        <w:t xml:space="preserve">Ajzen, I. (1991) 'The theory of planned behavior', Organizational Behavior and Human Decision Processes, 50(2), pp. 179–211.</w:t>
+        <w:t xml:space="preserve">Ajzen, I. (1991) 'The theory of planned behavior', Organizational Behavior and Human Decision Processes, 50(2), pp. 179-211.</w:t>
       </w:r>
     </w:p>
     <w:p>
@@ -5981,7 +5981,7 @@
           <w:sz w:val="20"/>
           <w:szCs w:val="20"/>
         </w:rPr>
-        <w:t xml:space="preserve">'Adopting an Extended Theory of Planned Behaviour for Nutrition-Labelled Menu Choice' (2023) [author/journal/volume/pages to confirm — PMC].</w:t>
+        <w:t xml:space="preserve">'Adopting an Extended Theory of Planned Behaviour for Nutrition-Labelled Menu Choice' (2023) [author/journal/volume/pages to confirm - PMC].</w:t>
       </w:r>
     </w:p>
     <w:p>
@@ -6009,7 +6009,7 @@
           <w:sz w:val="20"/>
           <w:szCs w:val="20"/>
         </w:rPr>
-        <w:t xml:space="preserve">Bujalance-López, M. et al. (2025) 'Menu engineering re-examined: item substitution effects in restaurant menu analysis', British Food Journal [volume/pages to confirm].</w:t>
+        <w:t xml:space="preserve">Bujalance-Lopez, M. et al. (2025) 'Menu engineering re-examined: item substitution effects in restaurant menu analysis', British Food Journal [volume/pages to confirm].</w:t>
       </w:r>
     </w:p>
     <w:p>
@@ -6023,7 +6023,7 @@
           <w:sz w:val="20"/>
           <w:szCs w:val="20"/>
         </w:rPr>
-        <w:t xml:space="preserve">'Constructing a consumption model of fine dining' (2023) [author/journal/volume/pages to confirm — PMC].</w:t>
+        <w:t xml:space="preserve">'Constructing a consumption model of fine dining' (2023) [author/journal/volume/pages to confirm - PMC].</w:t>
       </w:r>
     </w:p>
     <w:p>
@@ -6051,7 +6051,7 @@
           <w:sz w:val="20"/>
           <w:szCs w:val="20"/>
         </w:rPr>
-        <w:t xml:space="preserve">'Customer restaurant choice' (2023) [author/journal/volume/pages to confirm — PMC].</w:t>
+        <w:t xml:space="preserve">'Customer restaurant choice' (2023) [author/journal/volume/pages to confirm - PMC].</w:t>
       </w:r>
     </w:p>
     <w:p>
@@ -6331,7 +6331,7 @@
           <w:sz w:val="20"/>
           <w:szCs w:val="20"/>
         </w:rPr>
-        <w:t xml:space="preserve">Rules Restaurant (n.d.) Rules — menu and estate sourcing information. Available at: https://www.rules.co.uk (Accessed: 31 August 2026).</w:t>
+        <w:t xml:space="preserve">Rules Restaurant (n.d.) Rules - menu and estate sourcing information. Available at: https://www.rules.co.uk (Accessed: 31 August 2026).</w:t>
       </w:r>
     </w:p>
     <w:p>
@@ -6359,7 +6359,7 @@
           <w:sz w:val="20"/>
           <w:szCs w:val="20"/>
         </w:rPr>
-        <w:t xml:space="preserve">TripAdvisor (n.d.) Rules Restaurant, London — customer reviews. Available at: https://www.tripadvisor.com/Restaurant_Review-g186338-d700845-Reviews-Rules_Restaurant-London_England.html (Accessed: 31 August 2026).</w:t>
+        <w:t xml:space="preserve">TripAdvisor (n.d.) Rules Restaurant, London - customer reviews. Available at: https://www.tripadvisor.com/Restaurant_Review-g186338-d700845-Reviews-Rules_Restaurant-London_England.html (Accessed: 31 August 2026).</w:t>
       </w:r>
     </w:p>
     <w:p>
@@ -6553,7 +6553,7 @@
           <w:sz w:val="22"/>
           <w:szCs w:val="22"/>
         </w:rPr>
-        <w:t xml:space="preserve">• "Wonderful food and history, but the service felt frosty and unwelcoming for a first-time visitor." (paraphrased, TripAdvisor pattern)</w:t>
+        <w:t xml:space="preserve">- "Wonderful food and history, but the service felt frosty and unwelcoming for a first-time visitor." (paraphrased, TripAdvisor pattern)</w:t>
       </w:r>
     </w:p>
     <w:p>
@@ -6566,7 +6566,7 @@
           <w:sz w:val="22"/>
           <w:szCs w:val="22"/>
         </w:rPr>
-        <w:t xml:space="preserve">• "Beautiful room, but it felt aimed squarely at tourists rather than a place I'd bring my vegetarian friends." (paraphrased, TripAdvisor pattern)</w:t>
+        <w:t xml:space="preserve">- "Beautiful room, but it felt aimed squarely at tourists rather than a place I'd bring my vegetarian friends." (paraphrased, TripAdvisor pattern)</w:t>
       </w:r>
     </w:p>
     <w:sectPr>
@@ -6693,7 +6693,7 @@
         <w:sz w:val="16"/>
         <w:szCs w:val="16"/>
       </w:rPr>
-      <w:t xml:space="preserve">Rules Restaurant — Menu Evaluation and Redesign</w:t>
+      <w:t xml:space="preserve">Rules Restaurant - Menu Evaluation and Redesign</w:t>
     </w:r>
   </w:p>
 </w:hdr>

</xml_diff>